<commit_message>
p03: bukti git laporan
</commit_message>
<xml_diff>
--- a/laporan/p03_laporan_25430031.docx
+++ b/laporan/p03_laporan_25430031.docx
@@ -222,8 +222,6 @@
         </w:rPr>
         <w:t>Tanggal :  07-10-2026</w:t>
       </w:r>
-      <w:bookmarkStart w:id="0" w:name="_GoBack"/>
-      <w:bookmarkEnd w:id="0"/>
     </w:p>
     <w:p>
       <w:pPr>
@@ -822,6 +820,12 @@
             <w:insideH w:val="single" w:color="auto" w:sz="4" w:space="0"/>
             <w:insideV w:val="single" w:color="auto" w:sz="4" w:space="0"/>
           </w:tblBorders>
+          <w:tblCellMar>
+            <w:top w:w="0" w:type="dxa"/>
+            <w:left w:w="10" w:type="dxa"/>
+            <w:bottom w:w="0" w:type="dxa"/>
+            <w:right w:w="10" w:type="dxa"/>
+          </w:tblCellMar>
         </w:tblPrEx>
         <w:trPr>
           <w:tblHeader/>
@@ -2263,12 +2267,6 @@
             <w:insideH w:val="single" w:color="auto" w:sz="4" w:space="0"/>
             <w:insideV w:val="single" w:color="auto" w:sz="4" w:space="0"/>
           </w:tblBorders>
-          <w:tblCellMar>
-            <w:top w:w="0" w:type="dxa"/>
-            <w:left w:w="10" w:type="dxa"/>
-            <w:bottom w:w="0" w:type="dxa"/>
-            <w:right w:w="10" w:type="dxa"/>
-          </w:tblCellMar>
         </w:tblPrEx>
         <w:trPr>
           <w:tblHeader/>
@@ -6631,6 +6629,12 @@
             <w:insideH w:val="single" w:color="auto" w:sz="4" w:space="0"/>
             <w:insideV w:val="single" w:color="auto" w:sz="4" w:space="0"/>
           </w:tblBorders>
+          <w:tblCellMar>
+            <w:top w:w="0" w:type="dxa"/>
+            <w:left w:w="10" w:type="dxa"/>
+            <w:bottom w:w="0" w:type="dxa"/>
+            <w:right w:w="10" w:type="dxa"/>
+          </w:tblCellMar>
         </w:tblPrEx>
         <w:trPr>
           <w:tblHeader/>
@@ -9171,7 +9175,7 @@
         </w:tblCellMar>
       </w:tblPr>
       <w:tblGrid>
-        <w:gridCol w:w="9638"/>
+        <w:gridCol w:w="10038"/>
       </w:tblGrid>
       <w:tr>
         <w:tblPrEx>
@@ -9217,6 +9221,51 @@
                 <w:color w:val="auto"/>
               </w:rPr>
             </w:pPr>
+            <w:r>
+              <w:drawing>
+                <wp:inline distT="0" distB="0" distL="114300" distR="114300">
+                  <wp:extent cx="6113145" cy="3770630"/>
+                  <wp:effectExtent l="0" t="0" r="8255" b="1270"/>
+                  <wp:docPr id="9" name="Picture 8"/>
+                  <wp:cNvGraphicFramePr>
+                    <a:graphicFrameLocks xmlns:a="http://schemas.openxmlformats.org/drawingml/2006/main" noChangeAspect="1"/>
+                  </wp:cNvGraphicFramePr>
+                  <a:graphic xmlns:a="http://schemas.openxmlformats.org/drawingml/2006/main">
+                    <a:graphicData uri="http://schemas.openxmlformats.org/drawingml/2006/picture">
+                      <pic:pic xmlns:pic="http://schemas.openxmlformats.org/drawingml/2006/picture">
+                        <pic:nvPicPr>
+                          <pic:cNvPr id="9" name="Picture 8"/>
+                          <pic:cNvPicPr>
+                            <a:picLocks noChangeAspect="1"/>
+                          </pic:cNvPicPr>
+                        </pic:nvPicPr>
+                        <pic:blipFill>
+                          <a:blip r:embed="rId11"/>
+                          <a:stretch>
+                            <a:fillRect/>
+                          </a:stretch>
+                        </pic:blipFill>
+                        <pic:spPr>
+                          <a:xfrm>
+                            <a:off x="0" y="0"/>
+                            <a:ext cx="6113145" cy="3770630"/>
+                          </a:xfrm>
+                          <a:prstGeom prst="rect">
+                            <a:avLst/>
+                          </a:prstGeom>
+                          <a:noFill/>
+                          <a:ln>
+                            <a:noFill/>
+                          </a:ln>
+                        </pic:spPr>
+                      </pic:pic>
+                    </a:graphicData>
+                  </a:graphic>
+                </wp:inline>
+              </w:drawing>
+            </w:r>
+            <w:bookmarkStart w:id="0" w:name="_GoBack"/>
+            <w:bookmarkEnd w:id="0"/>
           </w:p>
         </w:tc>
       </w:tr>

</xml_diff>